<commit_message>
Etherscan verification, explorer links and a Sepolia/MetaMask guide
- npm run verify:sepolia publishes the contract source on Etherscan (hardhat-verify,
  Etherscan V2 key), with clear refusals, retry while Etherscan indexes, and the
  right constructor arguments.
- Shared explorer-link helper: the website links transaction hashes and contract code
  to Etherscan on public networks (local chain unchanged); deploy.js prints the links.
- SEPOLIA_GUIDE.md: accounts, faucet, RPC, MetaMask roles, deploy, verify, what to
  show on Etherscan, troubleshooting, with measured gas costs.
- 12 new tests (188 total), mutation-checked; docs and report updated to 188 tests.
</commit_message>
<xml_diff>
--- a/VeriList_Report.docx
+++ b/VeriList_Report.docx
@@ -389,7 +389,7 @@
         <w:rPr>
           <w:rFonts w:ascii="Arial" w:hAnsi="Arial" w:eastAsia="Arial"/>
         </w:rPr>
-        <w:t xml:space="preserve"> is a blockchain registry that fixes this at the source. The brand records its products, their details and its authorized sellers on the blockchain. A marketplace can create a listing only when the blockchain confirms that the product is real and active, its brand is verified, and the seller is authorized. Anyone can verify a listing live, and the answer changes the moment a brand or the admin changes something. The project has four Solidity smart contracts, a React website, 176 automated tests with 100% coverage, a static-analysis scan and a headless-browser test of the website.</w:t>
+        <w:t xml:space="preserve"> is a blockchain registry that fixes this at the source. The brand records its products, their details and its authorized sellers on the blockchain. A marketplace can create a listing only when the blockchain confirms that the product is real and active, its brand is verified, and the seller is authorized. Anyone can verify a listing live, and the answer changes the moment a brand or the admin changes something. The project has four Solidity smart contracts, a React website, 188 automated tests with 100% coverage, a static-analysis scan and a headless-browser test of the website.</w:t>
       </w:r>
     </w:p>
     <w:p>
@@ -1302,7 +1302,7 @@
                 <w:rFonts w:ascii="Arial" w:hAnsi="Arial" w:eastAsia="Arial"/>
                 <w:sz w:val="17"/>
               </w:rPr>
-              <w:t>176 tests; rules tagged [R1] to [R12]; integration story test</w:t>
+              <w:t>188 tests; rules tagged [R1] to [R12]; integration story tests</w:t>
             </w:r>
           </w:p>
         </w:tc>
@@ -1729,6 +1729,84 @@
                 <w:sz w:val="17"/>
               </w:rPr>
               <w:t>17-check smoke test (including keyboard focus, 375 px width, reduced motion) and a demo replay</w:t>
+            </w:r>
+          </w:p>
+        </w:tc>
+      </w:tr>
+      <w:tr>
+        <w:tc>
+          <w:tcPr>
+            <w:tcW w:type="dxa" w:w="2041"/>
+            <w:tcMar>
+              <w:top w:w="25" w:type="dxa"/>
+              <w:bottom w:w="25" w:type="dxa"/>
+              <w:left w:w="70" w:type="dxa"/>
+              <w:right w:w="70" w:type="dxa"/>
+            </w:tcMar>
+          </w:tcPr>
+          <w:p>
+            <w:pPr>
+              <w:spacing w:after="0" w:line="240" w:lineRule="auto"/>
+            </w:pPr>
+            <w:r>
+              <w:rPr>
+                <w:rFonts w:ascii="Arial" w:hAnsi="Arial" w:eastAsia="Arial"/>
+                <w:sz w:val="17"/>
+              </w:rPr>
+              <w:t>Etherscan + hardhat-verify</w:t>
+            </w:r>
+          </w:p>
+        </w:tc>
+        <w:tc>
+          <w:tcPr>
+            <w:tcW w:type="dxa" w:w="2211"/>
+            <w:tcMar>
+              <w:top w:w="25" w:type="dxa"/>
+              <w:bottom w:w="25" w:type="dxa"/>
+              <w:left w:w="70" w:type="dxa"/>
+              <w:right w:w="70" w:type="dxa"/>
+            </w:tcMar>
+          </w:tcPr>
+          <w:p>
+            <w:pPr>
+              <w:spacing w:after="0" w:line="240" w:lineRule="auto"/>
+            </w:pPr>
+            <w:r>
+              <w:rPr>
+                <w:rFonts w:ascii="Arial" w:hAnsi="Arial" w:eastAsia="Arial"/>
+                <w:sz w:val="17"/>
+              </w:rPr>
+              <w:t>Public block explorer</w:t>
+            </w:r>
+          </w:p>
+        </w:tc>
+        <w:tc>
+          <w:tcPr>
+            <w:tcW w:type="dxa" w:w="5386"/>
+            <w:tcMar>
+              <w:top w:w="25" w:type="dxa"/>
+              <w:bottom w:w="25" w:type="dxa"/>
+              <w:left w:w="70" w:type="dxa"/>
+              <w:right w:w="70" w:type="dxa"/>
+            </w:tcMar>
+          </w:tcPr>
+          <w:p>
+            <w:pPr>
+              <w:spacing w:after="0" w:line="240" w:lineRule="auto"/>
+            </w:pPr>
+            <w:r>
+              <w:rPr>
+                <w:rFonts w:ascii="Courier New" w:hAnsi="Courier New" w:eastAsia="Courier New"/>
+                <w:sz w:val="16"/>
+              </w:rPr>
+              <w:t>npm run verify:sepolia</w:t>
+            </w:r>
+            <w:r>
+              <w:rPr>
+                <w:rFonts w:ascii="Arial" w:hAnsi="Arial" w:eastAsia="Arial"/>
+                <w:sz w:val="17"/>
+              </w:rPr>
+              <w:t xml:space="preserve"> publishes the contract code; the website links every transaction to Etherscan (ready; needs the Sepolia deployment)</w:t>
             </w:r>
           </w:p>
         </w:tc>
@@ -2231,7 +2309,7 @@
                 <w:b/>
                 <w:sz w:val="17"/>
               </w:rPr>
-              <w:t>176 passing</w:t>
+              <w:t>188 passing</w:t>
             </w:r>
           </w:p>
         </w:tc>

</xml_diff>

<commit_message>
Record the live Sepolia deployment: addresses, Etherscan links, updated report and notes
</commit_message>
<xml_diff>
--- a/VeriList_Report.docx
+++ b/VeriList_Report.docx
@@ -389,7 +389,7 @@
         <w:rPr>
           <w:rFonts w:ascii="Arial" w:hAnsi="Arial" w:eastAsia="Arial"/>
         </w:rPr>
-        <w:t xml:space="preserve"> is a blockchain registry that fixes this at the source. The brand records its products, their details and its authorized sellers on the blockchain. A marketplace can create a listing only when the blockchain confirms that the product is real and active, its brand is verified, and the seller is authorized. Anyone can verify a listing live, and the answer changes the moment a brand or the admin changes something. The project has four Solidity smart contracts, a React website, 188 automated tests with 100% coverage, a static-analysis scan and a headless-browser test of the website.</w:t>
+        <w:t xml:space="preserve"> is a blockchain registry that fixes this at the source. The brand records its products, their details and its authorized sellers on the blockchain. A marketplace can create a listing only when the blockchain confirms that the product is real and active, its brand is verified, and the seller is authorized. Anyone can verify a listing live, and the answer changes the moment a brand or the admin changes something. The project has four Solidity smart contracts, a React website, 188 automated tests with 100% coverage, a static-analysis scan, a headless-browser test of the website, and a live deployment on the Sepolia test network with the contract code verified on Etherscan.</w:t>
       </w:r>
     </w:p>
     <w:p>
@@ -1657,7 +1657,7 @@
                 <w:rFonts w:ascii="Arial" w:hAnsi="Arial" w:eastAsia="Arial"/>
                 <w:sz w:val="17"/>
               </w:rPr>
-              <w:t>Local demo mode (account switcher) and MetaMask mode (Sepolia-ready)</w:t>
+              <w:t>Local demo mode (account switcher) and MetaMask mode for Sepolia (automated tests used a mock wallet)</w:t>
             </w:r>
           </w:p>
         </w:tc>
@@ -1806,7 +1806,7 @@
                 <w:rFonts w:ascii="Arial" w:hAnsi="Arial" w:eastAsia="Arial"/>
                 <w:sz w:val="17"/>
               </w:rPr>
-              <w:t xml:space="preserve"> publishes the contract code; the website links every transaction to Etherscan (ready; needs the Sepolia deployment)</w:t>
+              <w:t xml:space="preserve"> published the source of both contracts (verified); the website links every transaction to Etherscan</w:t>
             </w:r>
           </w:p>
         </w:tc>
@@ -2613,6 +2613,62 @@
                 <w:rFonts w:ascii="Arial" w:hAnsi="Arial" w:eastAsia="Arial"/>
                 <w:sz w:val="17"/>
               </w:rPr>
+              <w:t>Sepolia deployment</w:t>
+            </w:r>
+          </w:p>
+        </w:tc>
+        <w:tc>
+          <w:tcPr>
+            <w:tcW w:type="dxa" w:w="6690"/>
+            <w:tcMar>
+              <w:top w:w="25" w:type="dxa"/>
+              <w:bottom w:w="25" w:type="dxa"/>
+              <w:left w:w="70" w:type="dxa"/>
+              <w:right w:w="70" w:type="dxa"/>
+            </w:tcMar>
+          </w:tcPr>
+          <w:p>
+            <w:pPr>
+              <w:spacing w:after="0" w:line="240" w:lineRule="auto"/>
+            </w:pPr>
+            <w:r>
+              <w:rPr>
+                <w:rFonts w:ascii="Arial" w:hAnsi="Arial" w:eastAsia="Arial"/>
+                <w:b/>
+                <w:sz w:val="17"/>
+              </w:rPr>
+              <w:t>Live and verified on Etherscan</w:t>
+            </w:r>
+            <w:r>
+              <w:rPr>
+                <w:rFonts w:ascii="Arial" w:hAnsi="Arial" w:eastAsia="Arial"/>
+                <w:sz w:val="17"/>
+              </w:rPr>
+              <w:t>: both contracts (Solidity 0.8.24, optimizer 200 runs)</w:t>
+            </w:r>
+          </w:p>
+        </w:tc>
+      </w:tr>
+      <w:tr>
+        <w:tc>
+          <w:tcPr>
+            <w:tcW w:type="dxa" w:w="2948"/>
+            <w:tcMar>
+              <w:top w:w="25" w:type="dxa"/>
+              <w:bottom w:w="25" w:type="dxa"/>
+              <w:left w:w="70" w:type="dxa"/>
+              <w:right w:w="70" w:type="dxa"/>
+            </w:tcMar>
+          </w:tcPr>
+          <w:p>
+            <w:pPr>
+              <w:spacing w:after="0" w:line="240" w:lineRule="auto"/>
+            </w:pPr>
+            <w:r>
+              <w:rPr>
+                <w:rFonts w:ascii="Arial" w:hAnsi="Arial" w:eastAsia="Arial"/>
+                <w:sz w:val="17"/>
+              </w:rPr>
               <w:t>Compiler warnings</w:t>
             </w:r>
           </w:p>
@@ -2650,6 +2706,271 @@
     </w:p>
     <w:p>
       <w:pPr>
+        <w:spacing w:after="40"/>
+      </w:pPr>
+      <w:r>
+        <w:rPr>
+          <w:rFonts w:ascii="Arial" w:hAnsi="Arial" w:eastAsia="Arial"/>
+          <w:b/>
+        </w:rPr>
+        <w:t>Live on the Sepolia test network (October 2026).</w:t>
+      </w:r>
+      <w:r>
+        <w:rPr>
+          <w:rFonts w:ascii="Arial" w:hAnsi="Arial" w:eastAsia="Arial"/>
+        </w:rPr>
+        <w:t xml:space="preserve"> The source code of both contracts is public and verified on Etherscan, so anyone can read it and call its functions:</w:t>
+      </w:r>
+    </w:p>
+    <w:tbl>
+      <w:tblPr>
+        <w:tblStyle w:val="TableGrid"/>
+        <w:tblW w:type="auto" w:w="0"/>
+        <w:jc w:val="center"/>
+        <w:tblLayout w:type="fixed"/>
+        <w:tblLook w:firstColumn="1" w:firstRow="1" w:lastColumn="0" w:lastRow="0" w:noHBand="0" w:noVBand="1" w:val="04A0"/>
+        <w:tblLayout w:type="fixed"/>
+      </w:tblPr>
+      <w:tblGrid>
+        <w:gridCol w:w="1814"/>
+        <w:gridCol w:w="4649"/>
+        <w:gridCol w:w="3175"/>
+      </w:tblGrid>
+      <w:tr>
+        <w:tc>
+          <w:tcPr>
+            <w:tcW w:type="dxa" w:w="1814"/>
+            <w:shd w:val="clear" w:color="auto" w:fill="E6EDF8"/>
+            <w:tcMar>
+              <w:top w:w="25" w:type="dxa"/>
+              <w:bottom w:w="25" w:type="dxa"/>
+              <w:left w:w="70" w:type="dxa"/>
+              <w:right w:w="70" w:type="dxa"/>
+            </w:tcMar>
+          </w:tcPr>
+          <w:p>
+            <w:pPr>
+              <w:spacing w:after="0" w:line="240" w:lineRule="auto"/>
+            </w:pPr>
+            <w:r>
+              <w:rPr>
+                <w:rFonts w:ascii="Arial" w:hAnsi="Arial" w:eastAsia="Arial"/>
+                <w:b/>
+                <w:sz w:val="17"/>
+              </w:rPr>
+              <w:t>Contract</w:t>
+            </w:r>
+          </w:p>
+        </w:tc>
+        <w:tc>
+          <w:tcPr>
+            <w:tcW w:type="dxa" w:w="4649"/>
+            <w:shd w:val="clear" w:color="auto" w:fill="E6EDF8"/>
+            <w:tcMar>
+              <w:top w:w="25" w:type="dxa"/>
+              <w:bottom w:w="25" w:type="dxa"/>
+              <w:left w:w="70" w:type="dxa"/>
+              <w:right w:w="70" w:type="dxa"/>
+            </w:tcMar>
+          </w:tcPr>
+          <w:p>
+            <w:pPr>
+              <w:spacing w:after="0" w:line="240" w:lineRule="auto"/>
+            </w:pPr>
+            <w:r>
+              <w:rPr>
+                <w:rFonts w:ascii="Arial" w:hAnsi="Arial" w:eastAsia="Arial"/>
+                <w:b/>
+                <w:sz w:val="17"/>
+              </w:rPr>
+              <w:t>Address on Sepolia</w:t>
+            </w:r>
+          </w:p>
+        </w:tc>
+        <w:tc>
+          <w:tcPr>
+            <w:tcW w:type="dxa" w:w="3175"/>
+            <w:shd w:val="clear" w:color="auto" w:fill="E6EDF8"/>
+            <w:tcMar>
+              <w:top w:w="25" w:type="dxa"/>
+              <w:bottom w:w="25" w:type="dxa"/>
+              <w:left w:w="70" w:type="dxa"/>
+              <w:right w:w="70" w:type="dxa"/>
+            </w:tcMar>
+          </w:tcPr>
+          <w:p>
+            <w:pPr>
+              <w:spacing w:after="0" w:line="240" w:lineRule="auto"/>
+            </w:pPr>
+            <w:r>
+              <w:rPr>
+                <w:rFonts w:ascii="Arial" w:hAnsi="Arial" w:eastAsia="Arial"/>
+                <w:b/>
+                <w:sz w:val="17"/>
+              </w:rPr>
+              <w:t>Etherscan</w:t>
+            </w:r>
+          </w:p>
+        </w:tc>
+      </w:tr>
+      <w:tr>
+        <w:tc>
+          <w:tcPr>
+            <w:tcW w:type="dxa" w:w="1814"/>
+            <w:tcMar>
+              <w:top w:w="25" w:type="dxa"/>
+              <w:bottom w:w="25" w:type="dxa"/>
+              <w:left w:w="70" w:type="dxa"/>
+              <w:right w:w="70" w:type="dxa"/>
+            </w:tcMar>
+          </w:tcPr>
+          <w:p>
+            <w:pPr>
+              <w:spacing w:after="0" w:line="240" w:lineRule="auto"/>
+            </w:pPr>
+            <w:r>
+              <w:rPr>
+                <w:rFonts w:ascii="Arial" w:hAnsi="Arial" w:eastAsia="Arial"/>
+                <w:sz w:val="17"/>
+              </w:rPr>
+              <w:t>ProductRegistry</w:t>
+            </w:r>
+          </w:p>
+        </w:tc>
+        <w:tc>
+          <w:tcPr>
+            <w:tcW w:type="dxa" w:w="4649"/>
+            <w:tcMar>
+              <w:top w:w="25" w:type="dxa"/>
+              <w:bottom w:w="25" w:type="dxa"/>
+              <w:left w:w="70" w:type="dxa"/>
+              <w:right w:w="70" w:type="dxa"/>
+            </w:tcMar>
+          </w:tcPr>
+          <w:p>
+            <w:pPr>
+              <w:spacing w:after="0" w:line="240" w:lineRule="auto"/>
+            </w:pPr>
+            <w:r>
+              <w:rPr>
+                <w:rFonts w:ascii="Courier New" w:hAnsi="Courier New" w:eastAsia="Courier New"/>
+                <w:sz w:val="16"/>
+              </w:rPr>
+              <w:t>0x8CDe83A53062Dafa7122B2b268A1C916cD123e14</w:t>
+            </w:r>
+          </w:p>
+        </w:tc>
+        <w:tc>
+          <w:tcPr>
+            <w:tcW w:type="dxa" w:w="3175"/>
+            <w:tcMar>
+              <w:top w:w="25" w:type="dxa"/>
+              <w:bottom w:w="25" w:type="dxa"/>
+              <w:left w:w="70" w:type="dxa"/>
+              <w:right w:w="70" w:type="dxa"/>
+            </w:tcMar>
+          </w:tcPr>
+          <w:p>
+            <w:pPr>
+              <w:spacing w:after="0" w:line="240" w:lineRule="auto"/>
+            </w:pPr>
+            <w:hyperlink r:id="rId11">
+              <w:r>
+                <w:rPr>
+                  <w:rFonts w:ascii="Arial" w:hAnsi="Arial"/>
+                  <w:color w:val="1F4B8F"/>
+                  <w:sz w:val="17"/>
+                  <w:u w:val="single"/>
+                </w:rPr>
+                <w:t>View verified code</w:t>
+              </w:r>
+            </w:hyperlink>
+          </w:p>
+        </w:tc>
+      </w:tr>
+      <w:tr>
+        <w:tc>
+          <w:tcPr>
+            <w:tcW w:type="dxa" w:w="1814"/>
+            <w:tcMar>
+              <w:top w:w="25" w:type="dxa"/>
+              <w:bottom w:w="25" w:type="dxa"/>
+              <w:left w:w="70" w:type="dxa"/>
+              <w:right w:w="70" w:type="dxa"/>
+            </w:tcMar>
+          </w:tcPr>
+          <w:p>
+            <w:pPr>
+              <w:spacing w:after="0" w:line="240" w:lineRule="auto"/>
+            </w:pPr>
+            <w:r>
+              <w:rPr>
+                <w:rFonts w:ascii="Arial" w:hAnsi="Arial" w:eastAsia="Arial"/>
+                <w:sz w:val="17"/>
+              </w:rPr>
+              <w:t>ListingRegistry</w:t>
+            </w:r>
+          </w:p>
+        </w:tc>
+        <w:tc>
+          <w:tcPr>
+            <w:tcW w:type="dxa" w:w="4649"/>
+            <w:tcMar>
+              <w:top w:w="25" w:type="dxa"/>
+              <w:bottom w:w="25" w:type="dxa"/>
+              <w:left w:w="70" w:type="dxa"/>
+              <w:right w:w="70" w:type="dxa"/>
+            </w:tcMar>
+          </w:tcPr>
+          <w:p>
+            <w:pPr>
+              <w:spacing w:after="0" w:line="240" w:lineRule="auto"/>
+            </w:pPr>
+            <w:r>
+              <w:rPr>
+                <w:rFonts w:ascii="Courier New" w:hAnsi="Courier New" w:eastAsia="Courier New"/>
+                <w:sz w:val="16"/>
+              </w:rPr>
+              <w:t>0xEcA6cF8891201C4D83F503c439520Fc9aDFf4C57</w:t>
+            </w:r>
+          </w:p>
+        </w:tc>
+        <w:tc>
+          <w:tcPr>
+            <w:tcW w:type="dxa" w:w="3175"/>
+            <w:tcMar>
+              <w:top w:w="25" w:type="dxa"/>
+              <w:bottom w:w="25" w:type="dxa"/>
+              <w:left w:w="70" w:type="dxa"/>
+              <w:right w:w="70" w:type="dxa"/>
+            </w:tcMar>
+          </w:tcPr>
+          <w:p>
+            <w:pPr>
+              <w:spacing w:after="0" w:line="240" w:lineRule="auto"/>
+            </w:pPr>
+            <w:hyperlink r:id="rId12">
+              <w:r>
+                <w:rPr>
+                  <w:rFonts w:ascii="Arial" w:hAnsi="Arial"/>
+                  <w:color w:val="1F4B8F"/>
+                  <w:sz w:val="17"/>
+                  <w:u w:val="single"/>
+                </w:rPr>
+                <w:t>View verified code</w:t>
+              </w:r>
+            </w:hyperlink>
+          </w:p>
+        </w:tc>
+      </w:tr>
+    </w:tbl>
+    <w:p>
+      <w:pPr>
+        <w:spacing w:after="0"/>
+      </w:pPr>
+    </w:p>
+    <w:p>
+      <w:pPr>
         <w:keepNext/>
         <w:spacing w:after="20"/>
         <w:jc w:val="center"/>
@@ -2670,7 +2991,7 @@
                     <pic:cNvPicPr/>
                   </pic:nvPicPr>
                   <pic:blipFill>
-                    <a:blip r:embed="rId11"/>
+                    <a:blip r:embed="rId13"/>
                     <a:stretch>
                       <a:fillRect/>
                     </a:stretch>
@@ -2711,7 +3032,7 @@
                     <pic:cNvPicPr/>
                   </pic:nvPicPr>
                   <pic:blipFill>
-                    <a:blip r:embed="rId12"/>
+                    <a:blip r:embed="rId14"/>
                     <a:stretch>
                       <a:fillRect/>
                     </a:stretch>
@@ -2767,7 +3088,7 @@
                     <pic:cNvPicPr/>
                   </pic:nvPicPr>
                   <pic:blipFill>
-                    <a:blip r:embed="rId13"/>
+                    <a:blip r:embed="rId15"/>
                     <a:stretch>
                       <a:fillRect/>
                     </a:stretch>
@@ -3002,7 +3323,7 @@
         <w:rPr>
           <w:rFonts w:ascii="Arial" w:hAnsi="Arial" w:eastAsia="Arial"/>
         </w:rPr>
-        <w:t>Not deployed to Sepolia and not tested with a real MetaMask (a mock wallet was used). The multisig is a small teaching version and is not audited.</w:t>
+        <w:t>The contracts are live on Sepolia and verified on Etherscan, but the website has not yet been run end to end with a real MetaMask (automated tests used a mock wallet). The multisig is a small teaching version and is not audited.</w:t>
       </w:r>
     </w:p>
     <w:p>

</xml_diff>

<commit_message>
Address nicknames: show friendly names for sellers; docs and report updated to 194 tests
</commit_message>
<xml_diff>
--- a/VeriList_Report.docx
+++ b/VeriList_Report.docx
@@ -389,7 +389,7 @@
         <w:rPr>
           <w:rFonts w:ascii="Arial" w:hAnsi="Arial" w:eastAsia="Arial"/>
         </w:rPr>
-        <w:t xml:space="preserve"> is a blockchain registry that fixes this at the source. The brand records its products, their details and its authorized sellers on the blockchain. A marketplace can create a listing only when the blockchain confirms that the product is real and active, its brand is verified, and the seller is authorized. Anyone can verify a listing live, and the answer changes the moment a brand or the admin changes something. The project has four Solidity smart contracts, a React website, 188 automated tests with 100% coverage, a static-analysis scan, a headless-browser test of the website, and a live deployment on the Sepolia test network with the contract code verified on Etherscan.</w:t>
+        <w:t xml:space="preserve"> is a blockchain registry that fixes this at the source. The brand records its products, their details and its authorized sellers on the blockchain. A marketplace can create a listing only when the blockchain confirms that the product is real and active, its brand is verified, and the seller is authorized. Anyone can verify a listing live, and the answer changes the moment a brand or the admin changes something. The project has four Solidity smart contracts, a React website, 194 automated tests with 100% coverage, a static-analysis scan, a headless-browser test of the website, and a live deployment on the Sepolia test network with the contract code verified on Etherscan.</w:t>
       </w:r>
     </w:p>
     <w:p>
@@ -1302,7 +1302,7 @@
                 <w:rFonts w:ascii="Arial" w:hAnsi="Arial" w:eastAsia="Arial"/>
                 <w:sz w:val="17"/>
               </w:rPr>
-              <w:t>188 tests; rules tagged [R1] to [R12]; integration story tests</w:t>
+              <w:t>194 tests; rules tagged [R1] to [R12]; integration story tests</w:t>
             </w:r>
           </w:p>
         </w:tc>
@@ -2309,7 +2309,7 @@
                 <w:b/>
                 <w:sz w:val="17"/>
               </w:rPr>
-              <w:t>188 passing</w:t>
+              <w:t>194 passing</w:t>
             </w:r>
           </w:p>
         </w:tc>

</xml_diff>

<commit_message>
Name addresses inside the app: Name this address box for sellers, saved in the browser; docs and report updated to 205 tests
</commit_message>
<xml_diff>
--- a/VeriList_Report.docx
+++ b/VeriList_Report.docx
@@ -389,7 +389,7 @@
         <w:rPr>
           <w:rFonts w:ascii="Arial" w:hAnsi="Arial" w:eastAsia="Arial"/>
         </w:rPr>
-        <w:t xml:space="preserve"> is a blockchain registry that fixes this at the source. The brand records its products, their details and its authorized sellers on the blockchain. A marketplace can create a listing only when the blockchain confirms that the product is real and active, its brand is verified, and the seller is authorized. Anyone can verify a listing live, and the answer changes the moment a brand or the admin changes something. The project has four Solidity smart contracts, a React website, 194 automated tests with 100% coverage, a static-analysis scan, a headless-browser test of the website, and a live deployment on the Sepolia test network with the contract code verified on Etherscan.</w:t>
+        <w:t xml:space="preserve"> is a blockchain registry that fixes this at the source. The brand records its products, their details and its authorized sellers on the blockchain. A marketplace can create a listing only when the blockchain confirms that the product is real and active, its brand is verified, and the seller is authorized. Anyone can verify a listing live, and the answer changes the moment a brand or the admin changes something. The project has four Solidity smart contracts, a React website, 205 automated tests with 100% coverage, a static-analysis scan, a headless-browser test of the website, and a live deployment on the Sepolia test network with the contract code verified on Etherscan.</w:t>
       </w:r>
     </w:p>
     <w:p>
@@ -1302,7 +1302,7 @@
                 <w:rFonts w:ascii="Arial" w:hAnsi="Arial" w:eastAsia="Arial"/>
                 <w:sz w:val="17"/>
               </w:rPr>
-              <w:t>194 tests; rules tagged [R1] to [R12]; integration story tests</w:t>
+              <w:t>205 tests; rules tagged [R1] to [R12]; integration story tests</w:t>
             </w:r>
           </w:p>
         </w:tc>
@@ -1728,7 +1728,7 @@
                 <w:rFonts w:ascii="Arial" w:hAnsi="Arial" w:eastAsia="Arial"/>
                 <w:sz w:val="17"/>
               </w:rPr>
-              <w:t>17-check smoke test (including keyboard focus, 375 px width, reduced motion) and a demo replay</w:t>
+              <w:t>19-check smoke test (including keyboard focus, 375 px width, reduced motion) and a demo replay</w:t>
             </w:r>
           </w:p>
         </w:tc>
@@ -2159,7 +2159,20 @@
         <w:rPr>
           <w:rFonts w:ascii="Arial" w:hAnsi="Arial" w:eastAsia="Arial"/>
         </w:rPr>
-        <w:t xml:space="preserve"> a role-aware interface (it explains why an account cannot act), a friendly sentence for every custom error, a live activity feed, and a layout that works at 375 px.</w:t>
+        <w:t xml:space="preserve"> a role-aware interface (it explains why an account cannot act), a friendly sentence for every custom error, a live activity feed, a </w:t>
+      </w:r>
+      <w:r>
+        <w:rPr>
+          <w:rFonts w:ascii="Arial" w:hAnsi="Arial" w:eastAsia="Arial"/>
+          <w:b/>
+        </w:rPr>
+        <w:t>Name this address</w:t>
+      </w:r>
+      <w:r>
+        <w:rPr>
+          <w:rFonts w:ascii="Arial" w:hAnsi="Arial" w:eastAsia="Arial"/>
+        </w:rPr>
+        <w:t xml:space="preserve"> box so a seller can be given a friendly name inside the site (saved in the browser only, nothing on the chain), and a layout that works at 375 px.</w:t>
       </w:r>
     </w:p>
     <w:p>
@@ -2309,7 +2322,7 @@
                 <w:b/>
                 <w:sz w:val="17"/>
               </w:rPr>
-              <w:t>194 passing</w:t>
+              <w:t>205 passing</w:t>
             </w:r>
           </w:p>
         </w:tc>
@@ -2509,6 +2522,54 @@
                 <w:rFonts w:ascii="Arial" w:hAnsi="Arial" w:eastAsia="Arial"/>
                 <w:sz w:val="17"/>
               </w:rPr>
+              <w:t>Mutation check (address names)</w:t>
+            </w:r>
+          </w:p>
+        </w:tc>
+        <w:tc>
+          <w:tcPr>
+            <w:tcW w:type="dxa" w:w="6690"/>
+            <w:tcMar>
+              <w:top w:w="25" w:type="dxa"/>
+              <w:bottom w:w="25" w:type="dxa"/>
+              <w:left w:w="70" w:type="dxa"/>
+              <w:right w:w="70" w:type="dxa"/>
+            </w:tcMar>
+          </w:tcPr>
+          <w:p>
+            <w:pPr>
+              <w:spacing w:after="0" w:line="240" w:lineRule="auto"/>
+            </w:pPr>
+            <w:r>
+              <w:rPr>
+                <w:rFonts w:ascii="Arial" w:hAnsi="Arial" w:eastAsia="Arial"/>
+                <w:sz w:val="17"/>
+              </w:rPr>
+              <w:t>11 deliberate bugs put into the naming code; 10 caught, the 1 left changes nothing observable</w:t>
+            </w:r>
+          </w:p>
+        </w:tc>
+      </w:tr>
+      <w:tr>
+        <w:tc>
+          <w:tcPr>
+            <w:tcW w:type="dxa" w:w="2948"/>
+            <w:tcMar>
+              <w:top w:w="25" w:type="dxa"/>
+              <w:bottom w:w="25" w:type="dxa"/>
+              <w:left w:w="70" w:type="dxa"/>
+              <w:right w:w="70" w:type="dxa"/>
+            </w:tcMar>
+          </w:tcPr>
+          <w:p>
+            <w:pPr>
+              <w:spacing w:after="0" w:line="240" w:lineRule="auto"/>
+            </w:pPr>
+            <w:r>
+              <w:rPr>
+                <w:rFonts w:ascii="Arial" w:hAnsi="Arial" w:eastAsia="Arial"/>
+                <w:sz w:val="17"/>
+              </w:rPr>
               <w:t>Slither</w:t>
             </w:r>
           </w:p>
@@ -2581,7 +2642,7 @@
                 <w:b/>
                 <w:sz w:val="17"/>
               </w:rPr>
-              <w:t>17 / 17</w:t>
+              <w:t>19 / 19</w:t>
             </w:r>
             <w:r>
               <w:rPr>

</xml_diff>

<commit_message>
Add the hosted website link; report and docs updated to 210 tests
</commit_message>
<xml_diff>
--- a/VeriList_Report.docx
+++ b/VeriList_Report.docx
@@ -389,7 +389,7 @@
         <w:rPr>
           <w:rFonts w:ascii="Arial" w:hAnsi="Arial" w:eastAsia="Arial"/>
         </w:rPr>
-        <w:t xml:space="preserve"> is a blockchain registry that fixes this at the source. The brand records its products, their details and its authorized sellers on the blockchain. A marketplace can create a listing only when the blockchain confirms that the product is real and active, its brand is verified, and the seller is authorized. Anyone can verify a listing live, and the answer changes the moment a brand or the admin changes something. The project has four Solidity smart contracts, a React website, 205 automated tests with 100% coverage, a static-analysis scan, a headless-browser test of the website, and a live deployment on the Sepolia test network with the contract code verified on Etherscan.</w:t>
+        <w:t xml:space="preserve"> is a blockchain registry that fixes this at the source. The brand records its products, their details and its authorized sellers on the blockchain. A marketplace can create a listing only when the blockchain confirms that the product is real and active, its brand is verified, and the seller is authorized. Anyone can verify a listing live, and the answer changes the moment a brand or the admin changes something. The project has four Solidity smart contracts, a React website, 210 automated tests with 100% coverage, a static-analysis scan, a headless-browser test of the website, and a live deployment on the Sepolia test network with the contract code verified on Etherscan.</w:t>
       </w:r>
     </w:p>
     <w:p>
@@ -1302,7 +1302,7 @@
                 <w:rFonts w:ascii="Arial" w:hAnsi="Arial" w:eastAsia="Arial"/>
                 <w:sz w:val="17"/>
               </w:rPr>
-              <w:t>205 tests; rules tagged [R1] to [R12]; integration story tests</w:t>
+              <w:t>210 tests; rules tagged [R1] to [R12]; integration story tests</w:t>
             </w:r>
           </w:p>
         </w:tc>
@@ -2322,7 +2322,7 @@
                 <w:b/>
                 <w:sz w:val="17"/>
               </w:rPr>
-              <w:t>205 passing</w:t>
+              <w:t>210 passing</w:t>
             </w:r>
           </w:p>
         </w:tc>
@@ -2545,7 +2545,7 @@
                 <w:rFonts w:ascii="Arial" w:hAnsi="Arial" w:eastAsia="Arial"/>
                 <w:sz w:val="17"/>
               </w:rPr>
-              <w:t>11 deliberate bugs put into the naming code; 10 caught, the 1 left changes nothing observable</w:t>
+              <w:t>15 deliberate bugs put into the naming code; 14 caught, the 1 left changes nothing observable</w:t>
             </w:r>
           </w:p>
         </w:tc>
@@ -2819,7 +2819,7 @@
                 <w:b/>
                 <w:sz w:val="17"/>
               </w:rPr>
-              <w:t>Contract</w:t>
+              <w:t>What</w:t>
             </w:r>
           </w:p>
         </w:tc>
@@ -2844,7 +2844,7 @@
                 <w:b/>
                 <w:sz w:val="17"/>
               </w:rPr>
-              <w:t>Address on Sepolia</w:t>
+              <w:t>Address on Sepolia / website</w:t>
             </w:r>
           </w:p>
         </w:tc>
@@ -2869,7 +2869,7 @@
                 <w:b/>
                 <w:sz w:val="17"/>
               </w:rPr>
-              <w:t>Etherscan</w:t>
+              <w:t>Link</w:t>
             </w:r>
           </w:p>
         </w:tc>
@@ -3024,6 +3024,81 @@
           </w:p>
         </w:tc>
       </w:tr>
+      <w:tr>
+        <w:tc>
+          <w:tcPr>
+            <w:tcW w:type="dxa" w:w="1814"/>
+            <w:tcMar>
+              <w:top w:w="25" w:type="dxa"/>
+              <w:bottom w:w="25" w:type="dxa"/>
+              <w:left w:w="70" w:type="dxa"/>
+              <w:right w:w="70" w:type="dxa"/>
+            </w:tcMar>
+          </w:tcPr>
+          <w:p>
+            <w:pPr>
+              <w:spacing w:after="0" w:line="240" w:lineRule="auto"/>
+            </w:pPr>
+            <w:r>
+              <w:rPr>
+                <w:rFonts w:ascii="Arial" w:hAnsi="Arial" w:eastAsia="Arial"/>
+                <w:sz w:val="17"/>
+              </w:rPr>
+              <w:t>Website (needs MetaMask on Sepolia)</w:t>
+            </w:r>
+          </w:p>
+        </w:tc>
+        <w:tc>
+          <w:tcPr>
+            <w:tcW w:type="dxa" w:w="4649"/>
+            <w:tcMar>
+              <w:top w:w="25" w:type="dxa"/>
+              <w:bottom w:w="25" w:type="dxa"/>
+              <w:left w:w="70" w:type="dxa"/>
+              <w:right w:w="70" w:type="dxa"/>
+            </w:tcMar>
+          </w:tcPr>
+          <w:p>
+            <w:pPr>
+              <w:spacing w:after="0" w:line="240" w:lineRule="auto"/>
+            </w:pPr>
+            <w:r>
+              <w:rPr>
+                <w:rFonts w:ascii="Arial" w:hAnsi="Arial" w:eastAsia="Arial"/>
+                <w:sz w:val="17"/>
+              </w:rPr>
+              <w:t>https://enchanting-sunshine-b5a619.netlify.app</w:t>
+            </w:r>
+          </w:p>
+        </w:tc>
+        <w:tc>
+          <w:tcPr>
+            <w:tcW w:type="dxa" w:w="3175"/>
+            <w:tcMar>
+              <w:top w:w="25" w:type="dxa"/>
+              <w:bottom w:w="25" w:type="dxa"/>
+              <w:left w:w="70" w:type="dxa"/>
+              <w:right w:w="70" w:type="dxa"/>
+            </w:tcMar>
+          </w:tcPr>
+          <w:p>
+            <w:pPr>
+              <w:spacing w:after="0" w:line="240" w:lineRule="auto"/>
+            </w:pPr>
+            <w:hyperlink r:id="rId13">
+              <w:r>
+                <w:rPr>
+                  <w:rFonts w:ascii="Arial" w:hAnsi="Arial"/>
+                  <w:color w:val="1F4B8F"/>
+                  <w:sz w:val="17"/>
+                  <w:u w:val="single"/>
+                </w:rPr>
+                <w:t>Open the website</w:t>
+              </w:r>
+            </w:hyperlink>
+          </w:p>
+        </w:tc>
+      </w:tr>
     </w:tbl>
     <w:p>
       <w:pPr>
@@ -3052,7 +3127,7 @@
                     <pic:cNvPicPr/>
                   </pic:nvPicPr>
                   <pic:blipFill>
-                    <a:blip r:embed="rId13"/>
+                    <a:blip r:embed="rId14"/>
                     <a:stretch>
                       <a:fillRect/>
                     </a:stretch>
@@ -3093,7 +3168,7 @@
                     <pic:cNvPicPr/>
                   </pic:nvPicPr>
                   <pic:blipFill>
-                    <a:blip r:embed="rId14"/>
+                    <a:blip r:embed="rId15"/>
                     <a:stretch>
                       <a:fillRect/>
                     </a:stretch>
@@ -3149,7 +3224,7 @@
                     <pic:cNvPicPr/>
                   </pic:nvPicPr>
                   <pic:blipFill>
-                    <a:blip r:embed="rId15"/>
+                    <a:blip r:embed="rId16"/>
                     <a:stretch>
                       <a:fillRect/>
                     </a:stretch>

</xml_diff>